<commit_message>
docs: update GDD with additional figures and descriptions for gameplay mechanics
</commit_message>
<xml_diff>
--- a/gdd/GDD_Zero_Oil.docx
+++ b/gdd/GDD_Zero_Oil.docx
@@ -760,6 +760,179 @@
         <w:t xml:space="preserve">Tela do jogo com setas e pegadas (esquerda) e teste no console TTEA (direita).</w:t>
       </w:r>
     </w:p>
+    <w:tbl>
+      <w:tblPr>
+        <w:tblW w:type="dxa" w:w="8959"/>
+        <w:jc w:val="center"/>
+        <w:tblBorders>
+          <w:top w:val="none" w:color="FFFFFF" w:sz="0"/>
+          <w:left w:val="none" w:color="FFFFFF" w:sz="0"/>
+          <w:bottom w:val="none" w:color="FFFFFF" w:sz="0"/>
+          <w:right w:val="none" w:color="FFFFFF" w:sz="0"/>
+          <w:insideH w:val="none" w:color="FFFFFF" w:sz="0"/>
+          <w:insideV w:val="none" w:color="FFFFFF" w:sz="0"/>
+        </w:tblBorders>
+      </w:tblPr>
+      <w:tblGrid>
+        <w:gridCol w:w="4480"/>
+        <w:gridCol w:w="4479"/>
+      </w:tblGrid>
+      <w:tr>
+        <w:trPr>
+          <w:cantSplit/>
+        </w:trPr>
+        <w:tc>
+          <w:tcPr>
+            <w:tcW w:type="dxa" w:w="4480"/>
+            <w:tcBorders>
+              <w:top w:val="none" w:color="FFFFFF" w:sz="0"/>
+              <w:left w:val="none" w:color="FFFFFF" w:sz="0"/>
+              <w:bottom w:val="none" w:color="FFFFFF" w:sz="0"/>
+              <w:right w:val="none" w:color="FFFFFF" w:sz="0"/>
+            </w:tcBorders>
+            <w:tcMar>
+              <w:top w:type="dxa" w:w="0"/>
+              <w:left w:type="dxa" w:w="0"/>
+              <w:bottom w:type="dxa" w:w="0"/>
+              <w:right w:type="dxa" w:w="0"/>
+            </w:tcMar>
+            <w:vAlign w:val="center"/>
+          </w:tcPr>
+          <w:p>
+            <w:pPr>
+              <w:keepNext/>
+              <w:jc w:val="left"/>
+            </w:pPr>
+            <w:r>
+              <w:drawing>
+                <wp:inline distT="0" distB="0" distL="0" distR="0">
+                  <wp:extent cx="2806700" cy="1578610"/>
+                  <wp:effectExtent t="0" r="0" b="0" l="0"/>
+                  <wp:docPr id="101" name="Figura 101" descr="Barco pulando sobre um bloco de peixes"/>
+                  <wp:cNvGraphicFramePr>
+                    <a:graphicFrameLocks xmlns:a="http://schemas.openxmlformats.org/drawingml/2006/main" noChangeAspect="1"/>
+                  </wp:cNvGraphicFramePr>
+                  <a:graphic xmlns:a="http://schemas.openxmlformats.org/drawingml/2006/main">
+                    <a:graphicData uri="http://schemas.openxmlformats.org/drawingml/2006/picture">
+                      <pic:pic xmlns:pic="http://schemas.openxmlformats.org/drawingml/2006/picture">
+                        <pic:nvPicPr>
+                          <pic:cNvPr id="0" name="" descr=""/>
+                          <pic:cNvPicPr>
+                            <a:picLocks noChangeAspect="1" noChangeArrowheads="1"/>
+                          </pic:cNvPicPr>
+                        </pic:nvPicPr>
+                        <pic:blipFill>
+                          <a:blip r:embed="rId11" cstate="none"/>
+                          <a:srcRect/>
+                          <a:stretch>
+                            <a:fillRect/>
+                          </a:stretch>
+                        </pic:blipFill>
+                        <pic:spPr bwMode="auto">
+                          <a:xfrm>
+                            <a:off x="0" y="0"/>
+                            <a:ext cx="2806700" cy="1578610"/>
+                          </a:xfrm>
+                          <a:prstGeom prst="rect">
+                            <a:avLst/>
+                          </a:prstGeom>
+                        </pic:spPr>
+                      </pic:pic>
+                    </a:graphicData>
+                  </a:graphic>
+                </wp:inline>
+              </w:drawing>
+            </w:r>
+          </w:p>
+        </w:tc>
+        <w:tc>
+          <w:tcPr>
+            <w:tcW w:type="dxa" w:w="4479"/>
+            <w:tcBorders>
+              <w:top w:val="none" w:color="FFFFFF" w:sz="0"/>
+              <w:left w:val="none" w:color="FFFFFF" w:sz="0"/>
+              <w:bottom w:val="none" w:color="FFFFFF" w:sz="0"/>
+              <w:right w:val="none" w:color="FFFFFF" w:sz="0"/>
+            </w:tcBorders>
+            <w:tcMar>
+              <w:top w:type="dxa" w:w="0"/>
+              <w:left w:type="dxa" w:w="0"/>
+              <w:bottom w:type="dxa" w:w="0"/>
+              <w:right w:type="dxa" w:w="0"/>
+            </w:tcMar>
+            <w:vAlign w:val="center"/>
+          </w:tcPr>
+          <w:p>
+            <w:pPr>
+              <w:keepNext/>
+              <w:jc w:val="right"/>
+            </w:pPr>
+            <w:r>
+              <w:drawing>
+                <wp:inline distT="0" distB="0" distL="0" distR="0">
+                  <wp:extent cx="2806700" cy="1578610"/>
+                  <wp:effectExtent t="0" r="0" b="0" l="0"/>
+                  <wp:docPr id="102" name="Figura 102" descr="Jato d'agua e cones no rio 4"/>
+                  <wp:cNvGraphicFramePr>
+                    <a:graphicFrameLocks xmlns:a="http://schemas.openxmlformats.org/drawingml/2006/main" noChangeAspect="1"/>
+                  </wp:cNvGraphicFramePr>
+                  <a:graphic xmlns:a="http://schemas.openxmlformats.org/drawingml/2006/main">
+                    <a:graphicData uri="http://schemas.openxmlformats.org/drawingml/2006/picture">
+                      <pic:pic xmlns:pic="http://schemas.openxmlformats.org/drawingml/2006/picture">
+                        <pic:nvPicPr>
+                          <pic:cNvPr id="0" name="" descr=""/>
+                          <pic:cNvPicPr>
+                            <a:picLocks noChangeAspect="1" noChangeArrowheads="1"/>
+                          </pic:cNvPicPr>
+                        </pic:nvPicPr>
+                        <pic:blipFill>
+                          <a:blip r:embed="rId12" cstate="none"/>
+                          <a:srcRect/>
+                          <a:stretch>
+                            <a:fillRect/>
+                          </a:stretch>
+                        </pic:blipFill>
+                        <pic:spPr bwMode="auto">
+                          <a:xfrm>
+                            <a:off x="0" y="0"/>
+                            <a:ext cx="2806700" cy="1578610"/>
+                          </a:xfrm>
+                          <a:prstGeom prst="rect">
+                            <a:avLst/>
+                          </a:prstGeom>
+                        </pic:spPr>
+                      </pic:pic>
+                    </a:graphicData>
+                  </a:graphic>
+                </wp:inline>
+              </w:drawing>
+            </w:r>
+          </w:p>
+        </w:tc>
+      </w:tr>
+    </w:tbl>
+    <w:p>
+      <w:pPr>
+        <w:spacing w:line="360" w:before="40" w:after="160"/>
+        <w:jc w:val="center"/>
+      </w:pPr>
+      <w:r>
+        <w:rPr>
+          <w:b/>
+          <w:bCs/>
+          <w:color w:val="1F5F7A"/>
+        </w:rPr>
+        <w:t xml:space="preserve">Figura 2. </w:t>
+      </w:r>
+      <w:r>
+        <w:rPr>
+          <w:i/>
+          <w:iCs/>
+          <w:color w:val="404040"/>
+        </w:rPr>
+        <w:t xml:space="preserve">Pulo sobre um bloco de peixes, caindo no óleo à frente (esquerda) e jato d'água entre cones no rio 4 (direita).</w:t>
+      </w:r>
+    </w:p>
     <w:p>
       <w:pPr>
         <w:keepNext/>
@@ -967,7 +1140,7 @@
           <w:bCs/>
           <w:color w:val="1F5F7A"/>
         </w:rPr>
-        <w:t xml:space="preserve">Figura 2. </w:t>
+        <w:t xml:space="preserve">Figura 3. </w:t>
       </w:r>
       <w:r>
         <w:rPr>
@@ -1076,6 +1249,179 @@
         <w:t xml:space="preserve"> atropelar um peixe é penalizado; limpar não justifica outro dano.</w:t>
       </w:r>
     </w:p>
+    <w:tbl>
+      <w:tblPr>
+        <w:tblW w:type="dxa" w:w="8959"/>
+        <w:jc w:val="center"/>
+        <w:tblBorders>
+          <w:top w:val="none" w:color="FFFFFF" w:sz="0"/>
+          <w:left w:val="none" w:color="FFFFFF" w:sz="0"/>
+          <w:bottom w:val="none" w:color="FFFFFF" w:sz="0"/>
+          <w:right w:val="none" w:color="FFFFFF" w:sz="0"/>
+          <w:insideH w:val="none" w:color="FFFFFF" w:sz="0"/>
+          <w:insideV w:val="none" w:color="FFFFFF" w:sz="0"/>
+        </w:tblBorders>
+      </w:tblPr>
+      <w:tblGrid>
+        <w:gridCol w:w="4480"/>
+        <w:gridCol w:w="4479"/>
+      </w:tblGrid>
+      <w:tr>
+        <w:trPr>
+          <w:cantSplit/>
+        </w:trPr>
+        <w:tc>
+          <w:tcPr>
+            <w:tcW w:type="dxa" w:w="4480"/>
+            <w:tcBorders>
+              <w:top w:val="none" w:color="FFFFFF" w:sz="0"/>
+              <w:left w:val="none" w:color="FFFFFF" w:sz="0"/>
+              <w:bottom w:val="none" w:color="FFFFFF" w:sz="0"/>
+              <w:right w:val="none" w:color="FFFFFF" w:sz="0"/>
+            </w:tcBorders>
+            <w:tcMar>
+              <w:top w:type="dxa" w:w="0"/>
+              <w:left w:type="dxa" w:w="0"/>
+              <w:bottom w:type="dxa" w:w="0"/>
+              <w:right w:type="dxa" w:w="0"/>
+            </w:tcMar>
+            <w:vAlign w:val="center"/>
+          </w:tcPr>
+          <w:p>
+            <w:pPr>
+              <w:keepNext/>
+              <w:jc w:val="left"/>
+            </w:pPr>
+            <w:r>
+              <w:drawing>
+                <wp:inline distT="0" distB="0" distL="0" distR="0">
+                  <wp:extent cx="2806700" cy="1578610"/>
+                  <wp:effectExtent t="0" r="0" b="0" l="0"/>
+                  <wp:docPr id="103" name="Figura 103" descr="Descarga na estacao de reciclagem"/>
+                  <wp:cNvGraphicFramePr>
+                    <a:graphicFrameLocks xmlns:a="http://schemas.openxmlformats.org/drawingml/2006/main" noChangeAspect="1"/>
+                  </wp:cNvGraphicFramePr>
+                  <a:graphic xmlns:a="http://schemas.openxmlformats.org/drawingml/2006/main">
+                    <a:graphicData uri="http://schemas.openxmlformats.org/drawingml/2006/picture">
+                      <pic:pic xmlns:pic="http://schemas.openxmlformats.org/drawingml/2006/picture">
+                        <pic:nvPicPr>
+                          <pic:cNvPr id="0" name="" descr=""/>
+                          <pic:cNvPicPr>
+                            <a:picLocks noChangeAspect="1" noChangeArrowheads="1"/>
+                          </pic:cNvPicPr>
+                        </pic:nvPicPr>
+                        <pic:blipFill>
+                          <a:blip r:embed="rId13" cstate="none"/>
+                          <a:srcRect/>
+                          <a:stretch>
+                            <a:fillRect/>
+                          </a:stretch>
+                        </pic:blipFill>
+                        <pic:spPr bwMode="auto">
+                          <a:xfrm>
+                            <a:off x="0" y="0"/>
+                            <a:ext cx="2806700" cy="1578610"/>
+                          </a:xfrm>
+                          <a:prstGeom prst="rect">
+                            <a:avLst/>
+                          </a:prstGeom>
+                        </pic:spPr>
+                      </pic:pic>
+                    </a:graphicData>
+                  </a:graphic>
+                </wp:inline>
+              </w:drawing>
+            </w:r>
+          </w:p>
+        </w:tc>
+        <w:tc>
+          <w:tcPr>
+            <w:tcW w:type="dxa" w:w="4479"/>
+            <w:tcBorders>
+              <w:top w:val="none" w:color="FFFFFF" w:sz="0"/>
+              <w:left w:val="none" w:color="FFFFFF" w:sz="0"/>
+              <w:bottom w:val="none" w:color="FFFFFF" w:sz="0"/>
+              <w:right w:val="none" w:color="FFFFFF" w:sz="0"/>
+            </w:tcBorders>
+            <w:tcMar>
+              <w:top w:type="dxa" w:w="0"/>
+              <w:left w:type="dxa" w:w="0"/>
+              <w:bottom w:type="dxa" w:w="0"/>
+              <w:right w:type="dxa" w:w="0"/>
+            </w:tcMar>
+            <w:vAlign w:val="center"/>
+          </w:tcPr>
+          <w:p>
+            <w:pPr>
+              <w:keepNext/>
+              <w:jc w:val="right"/>
+            </w:pPr>
+            <w:r>
+              <w:drawing>
+                <wp:inline distT="0" distB="0" distL="0" distR="0">
+                  <wp:extent cx="2806700" cy="1578610"/>
+                  <wp:effectExtent t="0" r="0" b="0" l="0"/>
+                  <wp:docPr id="104" name="Figura 104" descr="Aviso de peixe atropelado"/>
+                  <wp:cNvGraphicFramePr>
+                    <a:graphicFrameLocks xmlns:a="http://schemas.openxmlformats.org/drawingml/2006/main" noChangeAspect="1"/>
+                  </wp:cNvGraphicFramePr>
+                  <a:graphic xmlns:a="http://schemas.openxmlformats.org/drawingml/2006/main">
+                    <a:graphicData uri="http://schemas.openxmlformats.org/drawingml/2006/picture">
+                      <pic:pic xmlns:pic="http://schemas.openxmlformats.org/drawingml/2006/picture">
+                        <pic:nvPicPr>
+                          <pic:cNvPr id="0" name="" descr=""/>
+                          <pic:cNvPicPr>
+                            <a:picLocks noChangeAspect="1" noChangeArrowheads="1"/>
+                          </pic:cNvPicPr>
+                        </pic:nvPicPr>
+                        <pic:blipFill>
+                          <a:blip r:embed="rId14" cstate="none"/>
+                          <a:srcRect/>
+                          <a:stretch>
+                            <a:fillRect/>
+                          </a:stretch>
+                        </pic:blipFill>
+                        <pic:spPr bwMode="auto">
+                          <a:xfrm>
+                            <a:off x="0" y="0"/>
+                            <a:ext cx="2806700" cy="1578610"/>
+                          </a:xfrm>
+                          <a:prstGeom prst="rect">
+                            <a:avLst/>
+                          </a:prstGeom>
+                        </pic:spPr>
+                      </pic:pic>
+                    </a:graphicData>
+                  </a:graphic>
+                </wp:inline>
+              </w:drawing>
+            </w:r>
+          </w:p>
+        </w:tc>
+      </w:tr>
+    </w:tbl>
+    <w:p>
+      <w:pPr>
+        <w:spacing w:line="360" w:before="40" w:after="160"/>
+        <w:jc w:val="center"/>
+      </w:pPr>
+      <w:r>
+        <w:rPr>
+          <w:b/>
+          <w:bCs/>
+          <w:color w:val="1F5F7A"/>
+        </w:rPr>
+        <w:t xml:space="preserve">Figura 4. </w:t>
+      </w:r>
+      <w:r>
+        <w:rPr>
+          <w:i/>
+          <w:iCs/>
+          <w:color w:val="404040"/>
+        </w:rPr>
+        <w:t xml:space="preserve">Caçamba cheia descarregada na estação de reciclagem, valendo o dobro (esquerda) e barco perdido ao atropelar um peixe (direita).</w:t>
+      </w:r>
+    </w:p>
     <w:p>
       <w:pPr>
         <w:spacing w:line="360" w:before="60" w:after="100"/>
@@ -1291,6 +1637,179 @@
       </w:pPr>
       <w:r>
         <w:t xml:space="preserve">O ritmo é arcade: o barco acelera, as curvas exigem antecipação e o combo recompensa rotas sem desperdício. A caçamba cheia valendo o dobro cria a decisão de arriscar mais uma mancha ou voltar à estação, e o pulo permite atravessar um bloco de peixes. Rios gerados a cada partida, vidas extras e o recorde pessoal mantêm o jogador voltando.</w:t>
+      </w:r>
+    </w:p>
+    <w:tbl>
+      <w:tblPr>
+        <w:tblW w:type="dxa" w:w="8959"/>
+        <w:jc w:val="center"/>
+        <w:tblBorders>
+          <w:top w:val="none" w:color="FFFFFF" w:sz="0"/>
+          <w:left w:val="none" w:color="FFFFFF" w:sz="0"/>
+          <w:bottom w:val="none" w:color="FFFFFF" w:sz="0"/>
+          <w:right w:val="none" w:color="FFFFFF" w:sz="0"/>
+          <w:insideH w:val="none" w:color="FFFFFF" w:sz="0"/>
+          <w:insideV w:val="none" w:color="FFFFFF" w:sz="0"/>
+        </w:tblBorders>
+      </w:tblPr>
+      <w:tblGrid>
+        <w:gridCol w:w="4480"/>
+        <w:gridCol w:w="4479"/>
+      </w:tblGrid>
+      <w:tr>
+        <w:trPr>
+          <w:cantSplit/>
+        </w:trPr>
+        <w:tc>
+          <w:tcPr>
+            <w:tcW w:type="dxa" w:w="4480"/>
+            <w:tcBorders>
+              <w:top w:val="none" w:color="FFFFFF" w:sz="0"/>
+              <w:left w:val="none" w:color="FFFFFF" w:sz="0"/>
+              <w:bottom w:val="none" w:color="FFFFFF" w:sz="0"/>
+              <w:right w:val="none" w:color="FFFFFF" w:sz="0"/>
+            </w:tcBorders>
+            <w:tcMar>
+              <w:top w:type="dxa" w:w="0"/>
+              <w:left w:type="dxa" w:w="0"/>
+              <w:bottom w:type="dxa" w:w="0"/>
+              <w:right w:type="dxa" w:w="0"/>
+            </w:tcMar>
+            <w:vAlign w:val="center"/>
+          </w:tcPr>
+          <w:p>
+            <w:pPr>
+              <w:keepNext/>
+              <w:jc w:val="left"/>
+            </w:pPr>
+            <w:r>
+              <w:drawing>
+                <wp:inline distT="0" distB="0" distL="0" distR="0">
+                  <wp:extent cx="2806700" cy="1578610"/>
+                  <wp:effectExtent t="0" r="0" b="0" l="0"/>
+                  <wp:docPr id="106" name="Figura 106" descr="Menu principal com o recorde"/>
+                  <wp:cNvGraphicFramePr>
+                    <a:graphicFrameLocks xmlns:a="http://schemas.openxmlformats.org/drawingml/2006/main" noChangeAspect="1"/>
+                  </wp:cNvGraphicFramePr>
+                  <a:graphic xmlns:a="http://schemas.openxmlformats.org/drawingml/2006/main">
+                    <a:graphicData uri="http://schemas.openxmlformats.org/drawingml/2006/picture">
+                      <pic:pic xmlns:pic="http://schemas.openxmlformats.org/drawingml/2006/picture">
+                        <pic:nvPicPr>
+                          <pic:cNvPr id="0" name="" descr=""/>
+                          <pic:cNvPicPr>
+                            <a:picLocks noChangeAspect="1" noChangeArrowheads="1"/>
+                          </pic:cNvPicPr>
+                        </pic:nvPicPr>
+                        <pic:blipFill>
+                          <a:blip r:embed="rId16" cstate="none"/>
+                          <a:srcRect/>
+                          <a:stretch>
+                            <a:fillRect/>
+                          </a:stretch>
+                        </pic:blipFill>
+                        <pic:spPr bwMode="auto">
+                          <a:xfrm>
+                            <a:off x="0" y="0"/>
+                            <a:ext cx="2806700" cy="1578610"/>
+                          </a:xfrm>
+                          <a:prstGeom prst="rect">
+                            <a:avLst/>
+                          </a:prstGeom>
+                        </pic:spPr>
+                      </pic:pic>
+                    </a:graphicData>
+                  </a:graphic>
+                </wp:inline>
+              </w:drawing>
+            </w:r>
+          </w:p>
+        </w:tc>
+        <w:tc>
+          <w:tcPr>
+            <w:tcW w:type="dxa" w:w="4479"/>
+            <w:tcBorders>
+              <w:top w:val="none" w:color="FFFFFF" w:sz="0"/>
+              <w:left w:val="none" w:color="FFFFFF" w:sz="0"/>
+              <w:bottom w:val="none" w:color="FFFFFF" w:sz="0"/>
+              <w:right w:val="none" w:color="FFFFFF" w:sz="0"/>
+            </w:tcBorders>
+            <w:tcMar>
+              <w:top w:type="dxa" w:w="0"/>
+              <w:left w:type="dxa" w:w="0"/>
+              <w:bottom w:type="dxa" w:w="0"/>
+              <w:right w:type="dxa" w:w="0"/>
+            </w:tcMar>
+            <w:vAlign w:val="center"/>
+          </w:tcPr>
+          <w:p>
+            <w:pPr>
+              <w:keepNext/>
+              <w:jc w:val="right"/>
+            </w:pPr>
+            <w:r>
+              <w:drawing>
+                <wp:inline distT="0" distB="0" distL="0" distR="0">
+                  <wp:extent cx="2806700" cy="1578610"/>
+                  <wp:effectExtent t="0" r="0" b="0" l="0"/>
+                  <wp:docPr id="107" name="Figura 107" descr="Fim da corrida com novo recorde"/>
+                  <wp:cNvGraphicFramePr>
+                    <a:graphicFrameLocks xmlns:a="http://schemas.openxmlformats.org/drawingml/2006/main" noChangeAspect="1"/>
+                  </wp:cNvGraphicFramePr>
+                  <a:graphic xmlns:a="http://schemas.openxmlformats.org/drawingml/2006/main">
+                    <a:graphicData uri="http://schemas.openxmlformats.org/drawingml/2006/picture">
+                      <pic:pic xmlns:pic="http://schemas.openxmlformats.org/drawingml/2006/picture">
+                        <pic:nvPicPr>
+                          <pic:cNvPr id="0" name="" descr=""/>
+                          <pic:cNvPicPr>
+                            <a:picLocks noChangeAspect="1" noChangeArrowheads="1"/>
+                          </pic:cNvPicPr>
+                        </pic:nvPicPr>
+                        <pic:blipFill>
+                          <a:blip r:embed="rId17" cstate="none"/>
+                          <a:srcRect/>
+                          <a:stretch>
+                            <a:fillRect/>
+                          </a:stretch>
+                        </pic:blipFill>
+                        <pic:spPr bwMode="auto">
+                          <a:xfrm>
+                            <a:off x="0" y="0"/>
+                            <a:ext cx="2806700" cy="1578610"/>
+                          </a:xfrm>
+                          <a:prstGeom prst="rect">
+                            <a:avLst/>
+                          </a:prstGeom>
+                        </pic:spPr>
+                      </pic:pic>
+                    </a:graphicData>
+                  </a:graphic>
+                </wp:inline>
+              </w:drawing>
+            </w:r>
+          </w:p>
+        </w:tc>
+      </w:tr>
+    </w:tbl>
+    <w:p>
+      <w:pPr>
+        <w:spacing w:line="360" w:before="40" w:after="160"/>
+        <w:jc w:val="center"/>
+      </w:pPr>
+      <w:r>
+        <w:rPr>
+          <w:b/>
+          <w:bCs/>
+          <w:color w:val="1F5F7A"/>
+        </w:rPr>
+        <w:t xml:space="preserve">Figura 5. </w:t>
+      </w:r>
+      <w:r>
+        <w:rPr>
+          <w:i/>
+          <w:iCs/>
+          <w:color w:val="404040"/>
+        </w:rPr>
+        <w:t xml:space="preserve">Menu principal com o recorde do jogador (esquerda) e fim da corrida com novo recorde (direita).</w:t>
       </w:r>
     </w:p>
     <w:p>

</xml_diff>